<commit_message>
Mt 20.1-16: DOCX do sermão regerado a partir da versão polida
Co-Authored-By: Claude Opus 5.5 <noreply@anthropic.com>
Claude-Session: https://claude.ai/code/session_01KQBNEWywzDtypjXvMaZ1z8
</commit_message>
<xml_diff>
--- a/estudos/mateus/20-1-16-sermao.docx
+++ b/estudos/mateus/20-1-16-sermao.docx
@@ -308,7 +308,7 @@
           <w:sz w:val="23"/>
           <w:szCs w:val="23"/>
         </w:rPr>
-        <w:t xml:space="preserve">Irmãos, estamos na nossa série Parábolas do Reino, e este é o nono sermão. Estamos no segundo bloco da série, que chamamos de "O Coração do Rei". A pergunta deste bloco é: que tipo de Rei governa esse Reino? Já vimos o Rei que sai atrás da ovelha perdida e da moeda perdida e faz festa quando encontra. Já vimos o pai que corre para o filho que volta — e que sai de casa de novo para rogar ao filho mais velho, que ficou do lado de fora da festa.</w:t>
+        <w:t xml:space="preserve">Este é o nono sermão da série Parábolas do Reino, no segundo bloco, que chamamos de "O Coração do Rei". A pergunta deste bloco é: que tipo de Rei governa esse Reino? Já vimos o Rei que sai atrás da ovelha perdida e da moeda perdida e faz festa quando encontra. Já vimos o pai que corre para o filho que volta — e que sai de casa de novo para rogar ao filho mais velho, que ficou do lado de fora da festa.</w:t>
       </w:r>
     </w:p>
     <w:p>
@@ -334,15 +334,6 @@
       <w:r>
         <w:rPr>
           <w:rFonts w:ascii="Cambria" w:cs="Cambria" w:eastAsia="Cambria" w:hAnsi="Cambria"/>
-          <w:color w:val="2B2B33"/>
-          <w:sz w:val="23"/>
-          <w:szCs w:val="23"/>
-        </w:rPr>
-        <w:t xml:space="preserve">Então, se vocês esquecerem tudo o que eu disser hoje, guardem isto: </w:t>
-      </w:r>
-      <w:r>
-        <w:rPr>
-          <w:rFonts w:ascii="Cambria" w:cs="Cambria" w:eastAsia="Cambria" w:hAnsi="Cambria"/>
           <w:b/>
           <w:bCs/>
           <w:color w:val="2B2B33"/>
@@ -350,21 +341,6 @@
           <w:szCs w:val="23"/>
         </w:rPr>
         <w:t xml:space="preserve">Deus é bom: ele reparte como Rei, não paga como patrão — e cura o olho ressentido.</w:t>
-      </w:r>
-    </w:p>
-    <w:p>
-      <w:pPr>
-        <w:spacing w:after="150" w:before="0" w:line="300" w:lineRule="auto"/>
-        <w:jc w:val="left"/>
-      </w:pPr>
-      <w:r>
-        <w:rPr>
-          <w:rFonts w:ascii="Cambria" w:cs="Cambria" w:eastAsia="Cambria" w:hAnsi="Cambria"/>
-          <w:color w:val="2B2B33"/>
-          <w:sz w:val="23"/>
-          <w:szCs w:val="23"/>
-        </w:rPr>
-        <w:t xml:space="preserve">Vamos lá.</w:t>
       </w:r>
     </w:p>
     <w:p>
@@ -415,7 +391,7 @@
           <w:sz w:val="23"/>
           <w:szCs w:val="23"/>
         </w:rPr>
-        <w:t xml:space="preserve">Eu quero começar com dois homens que estiveram muito perto de Jesus.</w:t>
+        <w:t xml:space="preserve">Dois homens estiveram muito perto de Jesus.</w:t>
       </w:r>
     </w:p>
     <w:p>
@@ -556,7 +532,7 @@
           <w:sz w:val="23"/>
           <w:szCs w:val="23"/>
         </w:rPr>
-        <w:t xml:space="preserve">Olha só que interessante: Jesus contou uma história para gente que fazia exatamente essa pergunta. E não eram os fariseus. Eram os discípulos dele. Pedro tinha acabado de dizer: "Eis que nós tudo deixamos e te seguimos; que, pois, teremos?" (19.27). Jesus prometeu que eles teriam, sim — tronos, cem vezes mais, vida eterna (19.28-29). E logo em seguida contou essa parábola.</w:t>
+        <w:t xml:space="preserve">Jesus contou uma história para gente que fazia exatamente essa pergunta. E não eram os fariseus. Eram os discípulos dele. Pedro tinha acabado de dizer: "Eis que nós tudo deixamos e te seguimos; que, pois, teremos?" (19.27). Jesus prometeu que eles teriam, sim — tronos, cem vezes mais, vida eterna (19.28-29). E logo em seguida contou essa parábola.</w:t>
       </w:r>
     </w:p>
     <w:p>
@@ -591,22 +567,22 @@
           <w:sz w:val="23"/>
           <w:szCs w:val="23"/>
         </w:rPr>
-        <w:t xml:space="preserve"> (v. 15). E é essa a pergunta que vai nos acompanhar até o fim.</w:t>
-      </w:r>
-    </w:p>
-    <w:p>
-      <w:pPr>
-        <w:spacing w:after="150" w:before="0" w:line="300" w:lineRule="auto"/>
-        <w:jc w:val="left"/>
-      </w:pPr>
-      <w:r>
-        <w:rPr>
-          <w:rFonts w:ascii="Cambria" w:cs="Cambria" w:eastAsia="Cambria" w:hAnsi="Cambria"/>
-          <w:color w:val="2B2B33"/>
-          <w:sz w:val="23"/>
-          <w:szCs w:val="23"/>
-        </w:rPr>
-        <w:t xml:space="preserve">Antes de tudo, uma ressalva honesta: Judas não se perdeu por fazer conta. Ele se perdeu porque traiu o Senhor e não creu. Mas a imagem fica: um olho que mede tudo em denário, levado até o fim, não consegue mais enxergar Jesus.</w:t>
+        <w:t xml:space="preserve"> (v. 15).</w:t>
+      </w:r>
+    </w:p>
+    <w:p>
+      <w:pPr>
+        <w:spacing w:after="150" w:before="0" w:line="300" w:lineRule="auto"/>
+        <w:jc w:val="left"/>
+      </w:pPr>
+      <w:r>
+        <w:rPr>
+          <w:rFonts w:ascii="Cambria" w:cs="Cambria" w:eastAsia="Cambria" w:hAnsi="Cambria"/>
+          <w:color w:val="2B2B33"/>
+          <w:sz w:val="23"/>
+          <w:szCs w:val="23"/>
+        </w:rPr>
+        <w:t xml:space="preserve">Uma ressalva: Judas não se perdeu por fazer conta. Ele se perdeu porque traiu o Senhor e não creu. Mas a imagem fica: um olho que mede tudo em denário, levado até o fim, não consegue mais enxergar Jesus.</w:t>
       </w:r>
     </w:p>
     <w:p>
@@ -674,7 +650,7 @@
           <w:sz w:val="23"/>
           <w:szCs w:val="23"/>
         </w:rPr>
-        <w:t xml:space="preserve">Pra entender essa parábola, a gente precisa ver a moldura em que Mateus a colocou. Volta comigo um pouquinho no capítulo 19.</w:t>
+        <w:t xml:space="preserve">Para entender essa parábola, é preciso ver a moldura em que Mateus a colocou, no capítulo 19.</w:t>
       </w:r>
     </w:p>
     <w:p>
@@ -724,7 +700,7 @@
           <w:sz w:val="23"/>
           <w:szCs w:val="23"/>
         </w:rPr>
-        <w:t xml:space="preserve"> para alcançar a vida eterna?" (19.16). Olha a lógica: o que eu preciso fazer de bom pra ganhar? E Jesus responde de um jeito estranho: "Por que me perguntas acerca do que é bom? </w:t>
+        <w:t xml:space="preserve"> para alcançar a vida eterna?" (19.16). A lógica é esta: o que eu preciso fazer de bom pra ganhar? E Jesus responde de um jeito estranho: "Por que me perguntas acerca do que é bom? </w:t>
       </w:r>
       <w:r>
         <w:rPr>
@@ -759,22 +735,22 @@
           <w:sz w:val="23"/>
           <w:szCs w:val="23"/>
         </w:rPr>
-        <w:t xml:space="preserve">Guarda essa palavra, "bom". Ela vai voltar no fim da parábola, na boca do dono da vinha.</w:t>
-      </w:r>
-    </w:p>
-    <w:p>
-      <w:pPr>
-        <w:spacing w:after="150" w:before="0" w:line="300" w:lineRule="auto"/>
-        <w:jc w:val="left"/>
-      </w:pPr>
-      <w:r>
-        <w:rPr>
-          <w:rFonts w:ascii="Cambria" w:cs="Cambria" w:eastAsia="Cambria" w:hAnsi="Cambria"/>
-          <w:color w:val="2B2B33"/>
-          <w:sz w:val="23"/>
-          <w:szCs w:val="23"/>
-        </w:rPr>
-        <w:t xml:space="preserve">Agora olha como a parábola começa. Ela não começa assim: "Alguns trabalhadores procuravam emprego...". Ela começa com o Senhor: "um dono de casa que </w:t>
+        <w:t xml:space="preserve">Essa palavra, "bom", vai voltar no fim da parábola, na boca do dono da vinha.</w:t>
+      </w:r>
+    </w:p>
+    <w:p>
+      <w:pPr>
+        <w:spacing w:after="150" w:before="0" w:line="300" w:lineRule="auto"/>
+        <w:jc w:val="left"/>
+      </w:pPr>
+      <w:r>
+        <w:rPr>
+          <w:rFonts w:ascii="Cambria" w:cs="Cambria" w:eastAsia="Cambria" w:hAnsi="Cambria"/>
+          <w:color w:val="2B2B33"/>
+          <w:sz w:val="23"/>
+          <w:szCs w:val="23"/>
+        </w:rPr>
+        <w:t xml:space="preserve">A parábola não começa assim: "Alguns trabalhadores procuravam emprego...". Ela começa com o Senhor: "um dono de casa que </w:t>
       </w:r>
       <w:r>
         <w:rPr>
@@ -809,7 +785,7 @@
           <w:sz w:val="23"/>
           <w:szCs w:val="23"/>
         </w:rPr>
-        <w:t xml:space="preserve">E ele não sai uma vez só. Olha o verso 3: "</w:t>
+        <w:t xml:space="preserve">E ele não sai uma vez só. Verso 3: "</w:t>
       </w:r>
       <w:r>
         <w:rPr>
@@ -884,22 +860,22 @@
           <w:sz w:val="23"/>
           <w:szCs w:val="23"/>
         </w:rPr>
-        <w:t xml:space="preserve">Vamos colocar no nosso relógio. O dia de trabalho ia do nascer do sol, mais ou menos seis da manhã, até o pôr do sol, mais ou menos seis da tarde. Às seis da manhã, ele contrata o primeiro grupo e combina o preço: um denário pelo dia (v. 2). O denário era o salário de um dia de trabalho braçal. Era o pão da família naquele dia. Às nove, ele volta e contrata mais gente, agora sem valor definido: "Ide vós também para a vinha, e vos darei o que for justo" (v. 4). Ao meio-dia e às três da tarde, a mesma coisa.</w:t>
-      </w:r>
-    </w:p>
-    <w:p>
-      <w:pPr>
-        <w:spacing w:after="150" w:before="0" w:line="300" w:lineRule="auto"/>
-        <w:jc w:val="left"/>
-      </w:pPr>
-      <w:r>
-        <w:rPr>
-          <w:rFonts w:ascii="Cambria" w:cs="Cambria" w:eastAsia="Cambria" w:hAnsi="Cambria"/>
-          <w:color w:val="2B2B33"/>
-          <w:sz w:val="23"/>
-          <w:szCs w:val="23"/>
-        </w:rPr>
-        <w:t xml:space="preserve">E aí, às cinco da tarde, faltando uma hora para acabar o dia, ele sai de novo. E Mateus troca o verbo. Nas outras vezes, ele "viu" gente na praça. Agora ele "</w:t>
+        <w:t xml:space="preserve">O dia de trabalho ia do nascer do sol, mais ou menos seis da manhã, até o pôr do sol, mais ou menos seis da tarde. Às seis da manhã, ele contrata o primeiro grupo e combina o preço: um denário pelo dia (v. 2). O denário era o salário de um dia de trabalho braçal. Era o pão da família naquele dia. Às nove, ele volta e contrata mais gente, agora sem valor definido: "Ide vós também para a vinha, e vos darei o que for justo" (v. 4). Ao meio-dia e às três da tarde, a mesma coisa.</w:t>
+      </w:r>
+    </w:p>
+    <w:p>
+      <w:pPr>
+        <w:spacing w:after="150" w:before="0" w:line="300" w:lineRule="auto"/>
+        <w:jc w:val="left"/>
+      </w:pPr>
+      <w:r>
+        <w:rPr>
+          <w:rFonts w:ascii="Cambria" w:cs="Cambria" w:eastAsia="Cambria" w:hAnsi="Cambria"/>
+          <w:color w:val="2B2B33"/>
+          <w:sz w:val="23"/>
+          <w:szCs w:val="23"/>
+        </w:rPr>
+        <w:t xml:space="preserve">Às cinco da tarde, faltando uma hora para acabar o dia, ele sai de novo. E Mateus troca o verbo. Nas outras vezes, ele "viu" gente na praça. Agora ele "</w:t>
       </w:r>
       <w:r>
         <w:rPr>
@@ -934,7 +910,7 @@
           <w:sz w:val="23"/>
           <w:szCs w:val="23"/>
         </w:rPr>
-        <w:t xml:space="preserve">Eu consigo enxergar essa cena aqui na Baixada. Cinco da manhã, num ponto conhecido, tem uns homens com a ferramenta no ombro esperando um carro parar pra pegar uma diária. Os mais fortes, os mais conhecidos, saem primeiro. O grupo vai diminuindo ao longo do dia. E às cinco da tarde ainda tem um ali. O que ninguém quis levar. E ele já sabe que hoje não vai ter pão em casa.</w:t>
+        <w:t xml:space="preserve">Essa cena existe aqui na Baixada. Cinco da manhã, num ponto conhecido, tem uns homens com a ferramenta no ombro esperando um carro parar pra pegar uma diária. Os mais fortes, os mais conhecidos, saem primeiro. O grupo vai diminuindo ao longo do dia. Às cinco da tarde ainda tem um ali. O que ninguém quis levar. E ele já sabe que hoje não vai ter pão em casa.</w:t>
       </w:r>
     </w:p>
     <w:p>
@@ -966,7 +942,7 @@
           <w:sz w:val="23"/>
           <w:szCs w:val="23"/>
         </w:rPr>
-        <w:t xml:space="preserve">O dono pergunta: "Por que estivestes aqui desocupados o dia todo?". E a resposta é de cortar o coração: "</w:t>
+        <w:t xml:space="preserve">O dono pergunta: "Por que estivestes aqui desocupados o dia todo?". E a resposta corta o coração: "</w:t>
       </w:r>
       <w:r>
         <w:rPr>
@@ -1001,22 +977,22 @@
           <w:sz w:val="23"/>
           <w:szCs w:val="23"/>
         </w:rPr>
-        <w:t xml:space="preserve">E o dono diz: "Ide vós também para a vinha". Repara: para esse grupo, não tem promessa nenhuma. Não tem "um denário", não tem "o que for justo". Só o convite. Do ponto de vista do negócio, contratar alguém às cinco da tarde não faz sentido nenhum. Ele não precisa desses homens. São eles que precisam dele.</w:t>
-      </w:r>
-    </w:p>
-    <w:p>
-      <w:pPr>
-        <w:spacing w:after="150" w:before="0" w:line="300" w:lineRule="auto"/>
-        <w:jc w:val="left"/>
-      </w:pPr>
-      <w:r>
-        <w:rPr>
-          <w:rFonts w:ascii="Cambria" w:cs="Cambria" w:eastAsia="Cambria" w:hAnsi="Cambria"/>
-          <w:color w:val="2B2B33"/>
-          <w:sz w:val="23"/>
-          <w:szCs w:val="23"/>
-        </w:rPr>
-        <w:t xml:space="preserve">Um comentarista chamado R. T. France resume isso de um jeito que eu gosto muito:</w:t>
+        <w:t xml:space="preserve">E o dono diz: "Ide vós também para a vinha". Para esse grupo, não tem promessa nenhuma. Não tem "um denário", não tem "o que for justo". Só o convite. Do ponto de vista do negócio, contratar alguém às cinco da tarde não faz sentido nenhum. Ele não precisa desses homens. São eles que precisam dele.</w:t>
+      </w:r>
+    </w:p>
+    <w:p>
+      <w:pPr>
+        <w:spacing w:after="150" w:before="0" w:line="300" w:lineRule="auto"/>
+        <w:jc w:val="left"/>
+      </w:pPr>
+      <w:r>
+        <w:rPr>
+          <w:rFonts w:ascii="Cambria" w:cs="Cambria" w:eastAsia="Cambria" w:hAnsi="Cambria"/>
+          <w:color w:val="2B2B33"/>
+          <w:sz w:val="23"/>
+          <w:szCs w:val="23"/>
+        </w:rPr>
+        <w:t xml:space="preserve">R. T. France resume:</w:t>
       </w:r>
     </w:p>
     <w:tbl>
@@ -1121,52 +1097,52 @@
           <w:sz w:val="23"/>
           <w:szCs w:val="23"/>
         </w:rPr>
-        <w:t xml:space="preserve">Irmãos, a bondade de Deus começa antes do pagamento. Começa na praça. Começa quando ele sai para buscar gente que ninguém quis.</w:t>
-      </w:r>
-    </w:p>
-    <w:p>
-      <w:pPr>
-        <w:spacing w:after="150" w:before="0" w:line="300" w:lineRule="auto"/>
-        <w:jc w:val="left"/>
-      </w:pPr>
-      <w:r>
-        <w:rPr>
-          <w:rFonts w:ascii="Cambria" w:cs="Cambria" w:eastAsia="Cambria" w:hAnsi="Cambria"/>
-          <w:color w:val="2B2B33"/>
-          <w:sz w:val="23"/>
-          <w:szCs w:val="23"/>
-        </w:rPr>
-        <w:t xml:space="preserve">E eu preciso dizer isso para você que está aqui há muito tempo: você também estava na praça um dia. Ninguém aqui se contratou sozinho. "Que tens tu que não tenhas recebido?" (1Co 4.7). Ser chamado para trabalhar na vinha do Senhor já é, em si, uma recompensa. Você tinha esquecido disso?</w:t>
-      </w:r>
-    </w:p>
-    <w:p>
-      <w:pPr>
-        <w:spacing w:after="150" w:before="0" w:line="300" w:lineRule="auto"/>
-        <w:jc w:val="left"/>
-      </w:pPr>
-      <w:r>
-        <w:rPr>
-          <w:rFonts w:ascii="Cambria" w:cs="Cambria" w:eastAsia="Cambria" w:hAnsi="Cambria"/>
-          <w:color w:val="2B2B33"/>
-          <w:sz w:val="23"/>
-          <w:szCs w:val="23"/>
-        </w:rPr>
-        <w:t xml:space="preserve">E para você que talvez esteja hoje se sentindo na praça às cinco da tarde — achando que já passou da hora, que ninguém mais vai te querer, que você desperdiçou tempo demais —, ouve isso: o Rei ainda sai. Ele sai às cinco da tarde.</w:t>
-      </w:r>
-    </w:p>
-    <w:p>
-      <w:pPr>
-        <w:spacing w:after="150" w:before="0" w:line="300" w:lineRule="auto"/>
-        <w:jc w:val="left"/>
-      </w:pPr>
-      <w:r>
-        <w:rPr>
-          <w:rFonts w:ascii="Cambria" w:cs="Cambria" w:eastAsia="Cambria" w:hAnsi="Cambria"/>
-          <w:color w:val="2B2B33"/>
-          <w:sz w:val="23"/>
-          <w:szCs w:val="23"/>
-        </w:rPr>
-        <w:t xml:space="preserve">Até aqui, irmãos, é uma história feliz. Todo mundo foi contratado, todo mundo trabalhou, todo mundo vai comer. Um final feliz parece certo. Mas aí chega a tarde. E chega a hora do pagamento.</w:t>
+        <w:t xml:space="preserve">A bondade de Deus começa antes do pagamento. Começa na praça. Começa quando ele sai para buscar gente que ninguém quis.</w:t>
+      </w:r>
+    </w:p>
+    <w:p>
+      <w:pPr>
+        <w:spacing w:after="150" w:before="0" w:line="300" w:lineRule="auto"/>
+        <w:jc w:val="left"/>
+      </w:pPr>
+      <w:r>
+        <w:rPr>
+          <w:rFonts w:ascii="Cambria" w:cs="Cambria" w:eastAsia="Cambria" w:hAnsi="Cambria"/>
+          <w:color w:val="2B2B33"/>
+          <w:sz w:val="23"/>
+          <w:szCs w:val="23"/>
+        </w:rPr>
+        <w:t xml:space="preserve">Você que está aqui há muito tempo: você também estava na praça um dia. Ninguém aqui se contratou sozinho. "Que tens tu que não tenhas recebido?" (1Co 4.7). Ser chamado para trabalhar na vinha do Senhor já é, em si, uma recompensa. Você tinha esquecido disso?</w:t>
+      </w:r>
+    </w:p>
+    <w:p>
+      <w:pPr>
+        <w:spacing w:after="150" w:before="0" w:line="300" w:lineRule="auto"/>
+        <w:jc w:val="left"/>
+      </w:pPr>
+      <w:r>
+        <w:rPr>
+          <w:rFonts w:ascii="Cambria" w:cs="Cambria" w:eastAsia="Cambria" w:hAnsi="Cambria"/>
+          <w:color w:val="2B2B33"/>
+          <w:sz w:val="23"/>
+          <w:szCs w:val="23"/>
+        </w:rPr>
+        <w:t xml:space="preserve">E para você que talvez esteja hoje se sentindo na praça às cinco da tarde — achando que já passou da hora, que ninguém mais vai te querer, que você desperdiçou tempo demais —: o Rei ainda sai. Ele sai às cinco da tarde.</w:t>
+      </w:r>
+    </w:p>
+    <w:p>
+      <w:pPr>
+        <w:spacing w:after="150" w:before="0" w:line="300" w:lineRule="auto"/>
+        <w:jc w:val="left"/>
+      </w:pPr>
+      <w:r>
+        <w:rPr>
+          <w:rFonts w:ascii="Cambria" w:cs="Cambria" w:eastAsia="Cambria" w:hAnsi="Cambria"/>
+          <w:color w:val="2B2B33"/>
+          <w:sz w:val="23"/>
+          <w:szCs w:val="23"/>
+        </w:rPr>
+        <w:t xml:space="preserve">Até aqui, é uma história feliz. Todo mundo foi contratado, todo mundo trabalhou, todo mundo vai comer. Um final feliz parece certo. Mas chega a tarde. E chega a hora do pagamento.</w:t>
       </w:r>
     </w:p>
     <w:p>
@@ -1249,7 +1225,7 @@
           <w:sz w:val="23"/>
           <w:szCs w:val="23"/>
         </w:rPr>
-        <w:t xml:space="preserve">Por quê? Pensa comigo. Se ele pagasse os primeiros primeiro, eles iam pegar o denário deles e ir embora felizes. Nunca iam saber quanto os outros receberam. A ordem invertida existe para uma coisa: para que os primeiros </w:t>
+        <w:t xml:space="preserve">Por quê? Se ele pagasse os primeiros primeiro, eles iam pegar o denário deles e ir embora felizes. Nunca iam saber quanto os outros receberam. A ordem invertida existe para uma coisa: para que os primeiros </w:t>
       </w:r>
       <w:r>
         <w:rPr>
@@ -1301,22 +1277,22 @@
           <w:sz w:val="23"/>
           <w:szCs w:val="23"/>
         </w:rPr>
-        <w:t xml:space="preserve">Um denário. O salário do dia inteiro, para quem trabalhou uma hora. Imagina a cara desses homens. Saíram de casa sem nada, passaram o dia na praça, já estavam imaginando a conversa com a mulher à noite, e voltam com o pão do dia inteiro na mão.</w:t>
-      </w:r>
-    </w:p>
-    <w:p>
-      <w:pPr>
-        <w:spacing w:after="150" w:before="0" w:line="300" w:lineRule="auto"/>
-        <w:jc w:val="left"/>
-      </w:pPr>
-      <w:r>
-        <w:rPr>
-          <w:rFonts w:ascii="Cambria" w:cs="Cambria" w:eastAsia="Cambria" w:hAnsi="Cambria"/>
-          <w:color w:val="2B2B33"/>
-          <w:sz w:val="23"/>
-          <w:szCs w:val="23"/>
-        </w:rPr>
-        <w:t xml:space="preserve">E olha um detalhe precioso do grego. No verso 8, o dono manda "pagar" (</w:t>
+        <w:t xml:space="preserve">Um denário. O salário do dia inteiro, para quem trabalhou uma hora. Esses homens saíram de casa sem nada, passaram o dia na praça, já imaginavam a conversa com a mulher à noite. E voltam com o pão do dia inteiro na mão.</w:t>
+      </w:r>
+    </w:p>
+    <w:p>
+      <w:pPr>
+        <w:spacing w:after="150" w:before="0" w:line="300" w:lineRule="auto"/>
+        <w:jc w:val="left"/>
+      </w:pPr>
+      <w:r>
+        <w:rPr>
+          <w:rFonts w:ascii="Cambria" w:cs="Cambria" w:eastAsia="Cambria" w:hAnsi="Cambria"/>
+          <w:color w:val="2B2B33"/>
+          <w:sz w:val="23"/>
+          <w:szCs w:val="23"/>
+        </w:rPr>
+        <w:t xml:space="preserve">O grego guarda um detalhe precioso. No verso 8, o dono manda "pagar" (</w:t>
       </w:r>
       <w:r>
         <w:rPr>
@@ -1371,7 +1347,7 @@
           <w:sz w:val="23"/>
           <w:szCs w:val="23"/>
         </w:rPr>
-        <w:t xml:space="preserve">Um biblista inglês chamado T. W. Manson lembrou de uma moeda daquela época, o pôndio, que valia a duodécima parte de um denário. Era, exatamente, o que seria "justo" pagar por uma hora de trabalho. E ele escreveu:</w:t>
+        <w:t xml:space="preserve">O biblista inglês T. W. Manson lembrou de uma moeda daquela época, o pôndio, que valia a duodécima parte de um denário. Era, exatamente, o que seria "justo" pagar por uma hora de trabalho. E ele escreveu:</w:t>
       </w:r>
     </w:p>
     <w:tbl>
@@ -1476,7 +1452,7 @@
           <w:sz w:val="23"/>
           <w:szCs w:val="23"/>
         </w:rPr>
-        <w:t xml:space="preserve">É isso, irmãos. O patrão paga por hora. O Rei reparte do que é dele. E o que ele reparte não se divide em fração.</w:t>
+        <w:t xml:space="preserve">O patrão paga por hora. O Rei reparte do que é dele. E o que ele reparte não se divide em fração.</w:t>
       </w:r>
     </w:p>
     <w:p>
@@ -1543,52 +1519,52 @@
           <w:sz w:val="23"/>
           <w:szCs w:val="23"/>
         </w:rPr>
-        <w:t xml:space="preserve">Repara: de manhã, esses homens não eram mercenários. Eram trabalhadores dispostos, que acordaram cedo, foram para a praça e ficaram felizes com o contrato. Um denário era um salário justo, e eles toparam. Mas quando viram o outro recebendo, a conta abriu. "Se ele, que trabalhou uma hora, ganhou um denário, a gente que trabalhou doze vai ganhar doze." E recebem... um denário.</w:t>
-      </w:r>
-    </w:p>
-    <w:p>
-      <w:pPr>
-        <w:spacing w:after="150" w:before="0" w:line="300" w:lineRule="auto"/>
-        <w:jc w:val="left"/>
-      </w:pPr>
-      <w:r>
-        <w:rPr>
-          <w:rFonts w:ascii="Cambria" w:cs="Cambria" w:eastAsia="Cambria" w:hAnsi="Cambria"/>
-          <w:color w:val="2B2B33"/>
-          <w:sz w:val="23"/>
-          <w:szCs w:val="23"/>
-        </w:rPr>
-        <w:t xml:space="preserve">Olha que coisa: o denário que às seis da manhã era alívio — "graças a Deus, hoje tem pão" — às seis da tarde virou ofensa. E não mudou um centavo. O que mudou foi a comparação.</w:t>
-      </w:r>
-    </w:p>
-    <w:p>
-      <w:pPr>
-        <w:spacing w:after="150" w:before="0" w:line="300" w:lineRule="auto"/>
-        <w:jc w:val="left"/>
-      </w:pPr>
-      <w:r>
-        <w:rPr>
-          <w:rFonts w:ascii="Cambria" w:cs="Cambria" w:eastAsia="Cambria" w:hAnsi="Cambria"/>
-          <w:color w:val="2B2B33"/>
-          <w:sz w:val="23"/>
-          <w:szCs w:val="23"/>
-        </w:rPr>
-        <w:t xml:space="preserve">E quero ser justo com o texto: Jesus não está dizendo que não existe recompensa. Ele acabou de prometer tronos e cem vezes mais para quem deixou tudo (19.28-29). A recompensa é real. O que a parábola diz é que ela tem outro molde. Não é o molde do mercado, é o molde do Reino.</w:t>
-      </w:r>
-    </w:p>
-    <w:p>
-      <w:pPr>
-        <w:spacing w:after="150" w:before="0" w:line="300" w:lineRule="auto"/>
-        <w:jc w:val="left"/>
-      </w:pPr>
-      <w:r>
-        <w:rPr>
-          <w:rFonts w:ascii="Cambria" w:cs="Cambria" w:eastAsia="Cambria" w:hAnsi="Cambria"/>
-          <w:color w:val="2B2B33"/>
-          <w:sz w:val="23"/>
-          <w:szCs w:val="23"/>
-        </w:rPr>
-        <w:t xml:space="preserve">O pastor Fritz Rienecker, comentando esse texto, disse uma frase que eu queria que vocês levassem pra casa:</w:t>
+        <w:t xml:space="preserve">De manhã, esses homens não eram mercenários. Eram trabalhadores dispostos, que acordaram cedo, foram para a praça e ficaram felizes com o contrato. Um denário era um salário justo, e eles toparam. Mas quando viram o outro recebendo, a conta abriu. "Se ele, que trabalhou uma hora, ganhou um denário, a gente que trabalhou doze vai ganhar doze." E recebem... um denário.</w:t>
+      </w:r>
+    </w:p>
+    <w:p>
+      <w:pPr>
+        <w:spacing w:after="150" w:before="0" w:line="300" w:lineRule="auto"/>
+        <w:jc w:val="left"/>
+      </w:pPr>
+      <w:r>
+        <w:rPr>
+          <w:rFonts w:ascii="Cambria" w:cs="Cambria" w:eastAsia="Cambria" w:hAnsi="Cambria"/>
+          <w:color w:val="2B2B33"/>
+          <w:sz w:val="23"/>
+          <w:szCs w:val="23"/>
+        </w:rPr>
+        <w:t xml:space="preserve">O denário que às seis da manhã era alívio — "graças a Deus, hoje tem pão" — às seis da tarde virou ofensa. E não mudou um centavo. O que mudou foi a comparação.</w:t>
+      </w:r>
+    </w:p>
+    <w:p>
+      <w:pPr>
+        <w:spacing w:after="150" w:before="0" w:line="300" w:lineRule="auto"/>
+        <w:jc w:val="left"/>
+      </w:pPr>
+      <w:r>
+        <w:rPr>
+          <w:rFonts w:ascii="Cambria" w:cs="Cambria" w:eastAsia="Cambria" w:hAnsi="Cambria"/>
+          <w:color w:val="2B2B33"/>
+          <w:sz w:val="23"/>
+          <w:szCs w:val="23"/>
+        </w:rPr>
+        <w:t xml:space="preserve">Jesus não está dizendo que não existe recompensa. Ele acabou de prometer tronos e cem vezes mais para quem deixou tudo (19.28-29). A recompensa é real. O que a parábola diz é que ela tem outro molde. Não é o molde do mercado, é o molde do Reino.</w:t>
+      </w:r>
+    </w:p>
+    <w:p>
+      <w:pPr>
+        <w:spacing w:after="150" w:before="0" w:line="300" w:lineRule="auto"/>
+        <w:jc w:val="left"/>
+      </w:pPr>
+      <w:r>
+        <w:rPr>
+          <w:rFonts w:ascii="Cambria" w:cs="Cambria" w:eastAsia="Cambria" w:hAnsi="Cambria"/>
+          <w:color w:val="2B2B33"/>
+          <w:sz w:val="23"/>
+          <w:szCs w:val="23"/>
+        </w:rPr>
+        <w:t xml:space="preserve">Fritz Rienecker, comentando esse texto:</w:t>
       </w:r>
     </w:p>
     <w:tbl>
@@ -1738,7 +1714,7 @@
           <w:sz w:val="23"/>
           <w:szCs w:val="23"/>
         </w:rPr>
-        <w:t xml:space="preserve">N. T. Wright coloca o contraste de um jeito muito bonito, e muito presbiteriano, embora ele seja anglicano:</w:t>
+        <w:t xml:space="preserve">N. T. Wright coloca o contraste assim:</w:t>
       </w:r>
     </w:p>
     <w:tbl>
@@ -1884,22 +1860,22 @@
           <w:sz w:val="23"/>
           <w:szCs w:val="23"/>
         </w:rPr>
-        <w:t xml:space="preserve">Deixa eu contar uma história que o pastor James Boice conta, sobre um evangelista chamado R. A. Torrey. Torrey estava fazendo uma série de reuniões sobre oração na Austrália, e antes de uma delas alguém colocou um bilhete na mão dele. Dizia mais ou menos assim: "Pastor, estou perplexo. Sou membro da igreja presbiteriana há trinta anos. Sou superintendente da escola dominical há vinte e cinco. Sou presbítero há vinte. E Deus não responde à minha oração. O senhor pode me explicar?". Torrey leu o bilhete em público e disse: "É fácil explicar. Esse homem acha que, por causa de trinta anos de igreja, Deus tem a obrigação de responder. Ele está orando em seu próprio nome". No fim da reunião, o autor do bilhete foi até ele e disse: "O senhor acertou".</w:t>
-      </w:r>
-    </w:p>
-    <w:p>
-      <w:pPr>
-        <w:spacing w:after="150" w:before="0" w:line="300" w:lineRule="auto"/>
-        <w:jc w:val="left"/>
-      </w:pPr>
-      <w:r>
-        <w:rPr>
-          <w:rFonts w:ascii="Cambria" w:cs="Cambria" w:eastAsia="Cambria" w:hAnsi="Cambria"/>
-          <w:color w:val="2B2B33"/>
-          <w:sz w:val="23"/>
-          <w:szCs w:val="23"/>
-        </w:rPr>
-        <w:t xml:space="preserve">Fala a verdade: quantos de nós temos um bilhete desses guardado no bolso? "Senhor, eu sirvo há tanto tempo..." Isso é o patrão. O Rei não funciona assim.</w:t>
+        <w:t xml:space="preserve">O pastor James Boice conta uma história sobre o evangelista R. A. Torrey. Torrey estava fazendo uma série de reuniões sobre oração na Austrália, e antes de uma delas alguém colocou um bilhete na mão dele. Dizia mais ou menos assim: "Pastor, estou perplexo. Sou membro da igreja presbiteriana há trinta anos. Sou superintendente da escola dominical há vinte e cinco. Sou presbítero há vinte. E Deus não responde à minha oração. O senhor pode me explicar?". Torrey leu o bilhete em público e disse: "É fácil explicar. Esse homem acha que, por causa de trinta anos de igreja, Deus tem a obrigação de responder. Ele está orando em seu próprio nome". No fim da reunião, o autor do bilhete foi até ele e disse: "O senhor acertou".</w:t>
+      </w:r>
+    </w:p>
+    <w:p>
+      <w:pPr>
+        <w:spacing w:after="150" w:before="0" w:line="300" w:lineRule="auto"/>
+        <w:jc w:val="left"/>
+      </w:pPr>
+      <w:r>
+        <w:rPr>
+          <w:rFonts w:ascii="Cambria" w:cs="Cambria" w:eastAsia="Cambria" w:hAnsi="Cambria"/>
+          <w:color w:val="2B2B33"/>
+          <w:sz w:val="23"/>
+          <w:szCs w:val="23"/>
+        </w:rPr>
+        <w:t xml:space="preserve">Quantos de nós temos um bilhete desses guardado no bolso? "Senhor, eu sirvo há tanto tempo..." Isso é o patrão. O Rei não funciona assim.</w:t>
       </w:r>
     </w:p>
     <w:p>
@@ -1997,7 +1973,7 @@
           <w:sz w:val="23"/>
           <w:szCs w:val="23"/>
         </w:rPr>
-        <w:t xml:space="preserve">E repara contra quem eles murmuram: "contra o </w:t>
+        <w:t xml:space="preserve">E eles murmuram "contra o </w:t>
       </w:r>
       <w:r>
         <w:rPr>
@@ -2049,7 +2025,7 @@
           <w:sz w:val="23"/>
           <w:szCs w:val="23"/>
         </w:rPr>
-        <w:t xml:space="preserve">Olha a queixa com atenção. Eles não dizem "você pagou pouco". Não podiam dizer isso: receberam exatamente o combinado. Eles dizem: "</w:t>
+        <w:t xml:space="preserve">Eles não dizem "você pagou pouco". Não podiam: receberam exatamente o combinado. Eles dizem: "</w:t>
       </w:r>
       <w:r>
         <w:rPr>
@@ -2069,7 +2045,7 @@
           <w:sz w:val="23"/>
           <w:szCs w:val="23"/>
         </w:rPr>
-        <w:t xml:space="preserve">". Repara: não é "tu nos fizeste iguais a eles". É "tu os fizeste iguais a nós". O foco está no que o outro recebeu.</w:t>
+        <w:t xml:space="preserve">". Não é "tu nos fizeste iguais a eles". É "tu os fizeste iguais a nós". O foco está no que o outro recebeu.</w:t>
       </w:r>
     </w:p>
     <w:p>
@@ -2099,7 +2075,7 @@
           <w:sz w:val="23"/>
           <w:szCs w:val="23"/>
         </w:rPr>
-        <w:t xml:space="preserve">Por que dói tanto ser igualado? C. S. Lewis tem uma observação que explica isso como poucas:</w:t>
+        <w:t xml:space="preserve">Por que dói tanto ser igualado? C. S. Lewis explica:</w:t>
       </w:r>
     </w:p>
     <w:tbl>
@@ -2204,7 +2180,7 @@
           <w:sz w:val="23"/>
           <w:szCs w:val="23"/>
         </w:rPr>
-        <w:t xml:space="preserve">É isso. Os primeiros trabalhadores não perderam nada. Perderam a vantagem. Perderam a distância. E quando a nossa identidade depende da distância, basta o outro subir para a gente se sentir menor — mesmo sem ter perdido coisa nenhuma.</w:t>
+        <w:t xml:space="preserve">Os primeiros trabalhadores não perderam nada. Perderam a vantagem. Perderam a distância. E quando a nossa identidade depende da distância, basta o outro subir para a gente se sentir menor — mesmo sem ter perdido coisa nenhuma.</w:t>
       </w:r>
     </w:p>
     <w:p>
@@ -2286,7 +2262,7 @@
           <w:sz w:val="23"/>
           <w:szCs w:val="23"/>
         </w:rPr>
-        <w:t xml:space="preserve">E olha a palavra "amigo". Em grego é </w:t>
+        <w:t xml:space="preserve">A palavra "amigo", em grego, é </w:t>
       </w:r>
       <w:r>
         <w:rPr>
@@ -2306,22 +2282,22 @@
           <w:sz w:val="23"/>
           <w:szCs w:val="23"/>
         </w:rPr>
-        <w:t xml:space="preserve">. Mateus usa essa palavra só três vezes no Evangelho inteiro: aqui, com o murmurador; no capítulo 22, com o homem que entrou na festa de casamento sem a roupa de festa; e no capítulo 26, quando Jesus olha para Judas no Getsêmani e diz: "Amigo, para que vieste?". É sempre alguém que está dentro e está errado. É uma repreensão gentil — mas é repreensão. E a porta, ainda assim, não é batida.</w:t>
-      </w:r>
-    </w:p>
-    <w:p>
-      <w:pPr>
-        <w:spacing w:after="150" w:before="0" w:line="300" w:lineRule="auto"/>
-        <w:jc w:val="left"/>
-      </w:pPr>
-      <w:r>
-        <w:rPr>
-          <w:rFonts w:ascii="Cambria" w:cs="Cambria" w:eastAsia="Cambria" w:hAnsi="Cambria"/>
-          <w:color w:val="2B2B33"/>
-          <w:sz w:val="23"/>
-          <w:szCs w:val="23"/>
-        </w:rPr>
-        <w:t xml:space="preserve">O R. C. Sproul resume o paradoxo dessa cena numa frase só:</w:t>
+        <w:t xml:space="preserve">. Mateus a usa só três vezes no Evangelho inteiro: aqui, com o murmurador; no capítulo 22, com o homem que entrou na festa de casamento sem a roupa de festa; e no capítulo 26, quando Jesus olha para Judas no Getsêmani e diz: "Amigo, para que vieste?". É sempre alguém que está dentro e está errado. É uma repreensão gentil — mas é repreensão. E a porta, ainda assim, não é batida.</w:t>
+      </w:r>
+    </w:p>
+    <w:p>
+      <w:pPr>
+        <w:spacing w:after="150" w:before="0" w:line="300" w:lineRule="auto"/>
+        <w:jc w:val="left"/>
+      </w:pPr>
+      <w:r>
+        <w:rPr>
+          <w:rFonts w:ascii="Cambria" w:cs="Cambria" w:eastAsia="Cambria" w:hAnsi="Cambria"/>
+          <w:color w:val="2B2B33"/>
+          <w:sz w:val="23"/>
+          <w:szCs w:val="23"/>
+        </w:rPr>
+        <w:t xml:space="preserve">R. C. Sproul resume o paradoxo dessa cena:</w:t>
       </w:r>
     </w:p>
     <w:tbl>
@@ -2426,7 +2402,7 @@
           <w:sz w:val="23"/>
           <w:szCs w:val="23"/>
         </w:rPr>
-        <w:t xml:space="preserve">Irmãos, pensa nisso com calma. Os únicos que receberam justiça foram os que reclamaram de injustiça. Todos os outros receberam graça. E aí eu preciso fazer a pergunta que o D. A. Carson faz, com uma franqueza que assusta:</w:t>
+        <w:t xml:space="preserve">Os únicos que receberam justiça foram os que reclamaram de injustiça. Todos os outros receberam graça. D. A. Carson leva isso até o fim, com uma franqueza que assusta:</w:t>
       </w:r>
     </w:p>
     <w:tbl>
@@ -2531,7 +2507,7 @@
           <w:sz w:val="23"/>
           <w:szCs w:val="23"/>
         </w:rPr>
-        <w:t xml:space="preserve">Ele não está xingando ninguém. Ele está fazendo a conta até o fim. Se você quer só justiça, se quer ser tratado exatamente pelo que merece, você está pedindo o inferno. Porque o único salário que nós conquistamos é a morte (Rm 6.23). Ninguém aqui deveria querer só justiça. A gente precisa desesperadamente de graça.</w:t>
+        <w:t xml:space="preserve">Ele não está xingando ninguém. Está fazendo a conta até o fim. Se você quer só justiça, se quer ser tratado exatamente pelo que merece, você está pedindo o inferno. Porque o único salário que nós conquistamos é a morte (Rm 6.23). Ninguém aqui deveria querer só justiça. A gente precisa desesperadamente de graça.</w:t>
       </w:r>
     </w:p>
     <w:p>
@@ -2598,7 +2574,7 @@
           <w:sz w:val="23"/>
           <w:szCs w:val="23"/>
         </w:rPr>
-        <w:t xml:space="preserve">Olha que coisa linda Mateus fez. Lembra que eu disse que essa seção tem uma moldura? No começo do capítulo 19, os fariseus chegam perguntando a Jesus: "</w:t>
+        <w:t xml:space="preserve">Mateus amarrou essa seção numa moldura. No começo do capítulo 19, os fariseus chegam perguntando a Jesus: "</w:t>
       </w:r>
       <w:r>
         <w:rPr>
@@ -2720,37 +2696,37 @@
           <w:sz w:val="23"/>
           <w:szCs w:val="23"/>
         </w:rPr>
-        <w:t xml:space="preserve">Lembra da palavra "bom"? O jovem rico perguntou o que fazer de bom. Jesus disse: "Bom só existe um". E agora o dono da vinha diz: "Eu sou bom". Ele está dizendo quem ele é.</w:t>
-      </w:r>
-    </w:p>
-    <w:p>
-      <w:pPr>
-        <w:spacing w:after="150" w:before="0" w:line="300" w:lineRule="auto"/>
-        <w:jc w:val="left"/>
-      </w:pPr>
-      <w:r>
-        <w:rPr>
-          <w:rFonts w:ascii="Cambria" w:cs="Cambria" w:eastAsia="Cambria" w:hAnsi="Cambria"/>
-          <w:color w:val="2B2B33"/>
-          <w:sz w:val="23"/>
-          <w:szCs w:val="23"/>
-        </w:rPr>
-        <w:t xml:space="preserve">"Olho mau" era um jeito judeu de falar da inveja, da mesquinharia. Provérbios diz o contrário: "O de olhos bons será abençoado, porque dá do seu pão ao pobre" (Pv 22.9). Olha que coisa: o jovem rico não quis dar aos pobres. O dono da vinha deu a quem ninguém contratou. Deus é bom porque dá. E os primeiros trabalhadores, que tinham deixado tudo, descobrem dentro de si o mesmo olho do homem que não quis deixar nada.</w:t>
-      </w:r>
-    </w:p>
-    <w:p>
-      <w:pPr>
-        <w:spacing w:after="150" w:before="0" w:line="300" w:lineRule="auto"/>
-        <w:jc w:val="left"/>
-      </w:pPr>
-      <w:r>
-        <w:rPr>
-          <w:rFonts w:ascii="Cambria" w:cs="Cambria" w:eastAsia="Cambria" w:hAnsi="Cambria"/>
-          <w:color w:val="2B2B33"/>
-          <w:sz w:val="23"/>
-          <w:szCs w:val="23"/>
-        </w:rPr>
-        <w:t xml:space="preserve">E até a nossa língua guarda isso. A palavra "inveja" vem do latim </w:t>
+        <w:t xml:space="preserve">A palavra "bom" voltou. O jovem rico perguntou o que fazer de bom. Jesus disse: "Bom só existe um". E agora o dono da vinha diz: "Eu sou bom". Ele está dizendo quem ele é.</w:t>
+      </w:r>
+    </w:p>
+    <w:p>
+      <w:pPr>
+        <w:spacing w:after="150" w:before="0" w:line="300" w:lineRule="auto"/>
+        <w:jc w:val="left"/>
+      </w:pPr>
+      <w:r>
+        <w:rPr>
+          <w:rFonts w:ascii="Cambria" w:cs="Cambria" w:eastAsia="Cambria" w:hAnsi="Cambria"/>
+          <w:color w:val="2B2B33"/>
+          <w:sz w:val="23"/>
+          <w:szCs w:val="23"/>
+        </w:rPr>
+        <w:t xml:space="preserve">"Olho mau" era um jeito judeu de falar da inveja, da mesquinharia. Provérbios diz o contrário: "O de olhos bons será abençoado, porque dá do seu pão ao pobre" (Pv 22.9). O jovem rico não quis dar aos pobres. O dono da vinha deu a quem ninguém contratou. Deus é bom porque dá. E os primeiros trabalhadores, que tinham deixado tudo, descobrem dentro de si o mesmo olho do homem que não quis deixar nada.</w:t>
+      </w:r>
+    </w:p>
+    <w:p>
+      <w:pPr>
+        <w:spacing w:after="150" w:before="0" w:line="300" w:lineRule="auto"/>
+        <w:jc w:val="left"/>
+      </w:pPr>
+      <w:r>
+        <w:rPr>
+          <w:rFonts w:ascii="Cambria" w:cs="Cambria" w:eastAsia="Cambria" w:hAnsi="Cambria"/>
+          <w:color w:val="2B2B33"/>
+          <w:sz w:val="23"/>
+          <w:szCs w:val="23"/>
+        </w:rPr>
+        <w:t xml:space="preserve">Até a nossa língua guarda isso. A palavra "inveja" vem do latim </w:t>
       </w:r>
       <w:r>
         <w:rPr>
@@ -2895,22 +2871,22 @@
           <w:sz w:val="23"/>
           <w:szCs w:val="23"/>
         </w:rPr>
-        <w:t xml:space="preserve">É exatamente o que aconteceu na vinha. Ninguém tirou nada dos primeiros trabalhadores. Mas eles sentiram o bem dos outros como se fosse um mal contra eles.</w:t>
-      </w:r>
-    </w:p>
-    <w:p>
-      <w:pPr>
-        <w:spacing w:after="150" w:before="0" w:line="300" w:lineRule="auto"/>
-        <w:jc w:val="left"/>
-      </w:pPr>
-      <w:r>
-        <w:rPr>
-          <w:rFonts w:ascii="Cambria" w:cs="Cambria" w:eastAsia="Cambria" w:hAnsi="Cambria"/>
-          <w:color w:val="2B2B33"/>
-          <w:sz w:val="23"/>
-          <w:szCs w:val="23"/>
-        </w:rPr>
-        <w:t xml:space="preserve">E por baixo disso, irmãos, tem uma mentira muito antiga. No Éden, Deus disse: "De </w:t>
+        <w:t xml:space="preserve">Foi o que aconteceu na vinha. Ninguém tirou nada dos primeiros trabalhadores. Mas eles sentiram o bem dos outros como se fosse um mal contra eles.</w:t>
+      </w:r>
+    </w:p>
+    <w:p>
+      <w:pPr>
+        <w:spacing w:after="150" w:before="0" w:line="300" w:lineRule="auto"/>
+        <w:jc w:val="left"/>
+      </w:pPr>
+      <w:r>
+        <w:rPr>
+          <w:rFonts w:ascii="Cambria" w:cs="Cambria" w:eastAsia="Cambria" w:hAnsi="Cambria"/>
+          <w:color w:val="2B2B33"/>
+          <w:sz w:val="23"/>
+          <w:szCs w:val="23"/>
+        </w:rPr>
+        <w:t xml:space="preserve">E por baixo disso tem uma mentira muito antiga. No Éden, Deus disse: "De </w:t>
       </w:r>
       <w:r>
         <w:rPr>
@@ -2945,22 +2921,22 @@
           <w:sz w:val="23"/>
           <w:szCs w:val="23"/>
         </w:rPr>
-        <w:t xml:space="preserve">A parábola termina aí, numa pergunta sem resposta. Igual ao livro de Jonas, que termina com Deus perguntando ao profeta ressentido. Igual à parábola do pai e dos dois filhos, que termina com o filho mais velho do lado de fora da festa. Jesus não responde por eles. Deixa a pergunta no ar.</w:t>
-      </w:r>
-    </w:p>
-    <w:p>
-      <w:pPr>
-        <w:spacing w:after="150" w:before="0" w:line="300" w:lineRule="auto"/>
-        <w:jc w:val="left"/>
-      </w:pPr>
-      <w:r>
-        <w:rPr>
-          <w:rFonts w:ascii="Cambria" w:cs="Cambria" w:eastAsia="Cambria" w:hAnsi="Cambria"/>
-          <w:color w:val="2B2B33"/>
-          <w:sz w:val="23"/>
-          <w:szCs w:val="23"/>
-        </w:rPr>
-        <w:t xml:space="preserve">Mas Mateus não deixa a gente esperar muito pela resposta errada. Olha o verso 20. Alguns minutos depois, na mesma estrada para Jerusalém, a mãe dos filhos de Zebedeu se ajoelha diante de Jesus. Jesus pergunta: "</w:t>
+        <w:t xml:space="preserve">A parábola termina aí, numa pergunta sem resposta. Igual ao livro de Jonas, que termina com Deus perguntando ao profeta ressentido. Jesus não responde por eles. Deixa a pergunta no ar.</w:t>
+      </w:r>
+    </w:p>
+    <w:p>
+      <w:pPr>
+        <w:spacing w:after="150" w:before="0" w:line="300" w:lineRule="auto"/>
+        <w:jc w:val="left"/>
+      </w:pPr>
+      <w:r>
+        <w:rPr>
+          <w:rFonts w:ascii="Cambria" w:cs="Cambria" w:eastAsia="Cambria" w:hAnsi="Cambria"/>
+          <w:color w:val="2B2B33"/>
+          <w:sz w:val="23"/>
+          <w:szCs w:val="23"/>
+        </w:rPr>
+        <w:t xml:space="preserve">Mas Mateus não deixa a gente esperar muito pela resposta errada. No verso 20, alguns minutos depois, na mesma estrada para Jerusalém, a mãe dos filhos de Zebedeu se ajoelha diante de Jesus. Jesus pergunta: "</w:t>
       </w:r>
       <w:r>
         <w:rPr>
@@ -3030,7 +3006,7 @@
           <w:sz w:val="23"/>
           <w:szCs w:val="23"/>
         </w:rPr>
-        <w:t xml:space="preserve">O Bonhoeffer, escrevendo sobre a vida em comunidade, comentou a discussão dos discípulos sobre quem era o maior, e disse algo que eu acho que toda igreja precisava ouvir:</w:t>
+        <w:t xml:space="preserve">Bonhoeffer, escrevendo sobre a vida em comunidade, comentou a discussão dos discípulos sobre quem era o maior:</w:t>
       </w:r>
     </w:p>
     <w:tbl>
@@ -3135,48 +3111,41 @@
           <w:sz w:val="23"/>
           <w:szCs w:val="23"/>
         </w:rPr>
-        <w:t xml:space="preserve">Irmãos, isso não é coisa de outra igreja. É coisa de toda igreja. É coisa da nossa.</w:t>
-      </w:r>
-    </w:p>
-    <w:p>
-      <w:pPr>
-        <w:spacing w:after="150" w:before="0" w:line="300" w:lineRule="auto"/>
-        <w:jc w:val="left"/>
-      </w:pPr>
-      <w:r>
-        <w:rPr>
-          <w:rFonts w:ascii="Cambria" w:cs="Cambria" w:eastAsia="Cambria" w:hAnsi="Cambria"/>
-          <w:color w:val="2B2B33"/>
-          <w:sz w:val="23"/>
-          <w:szCs w:val="23"/>
-        </w:rPr>
-        <w:t xml:space="preserve">E eu vou começar por mim. Eu sou pastor, e pastor é um trabalhador da primeira hora profissional. Eu me pego fazendo conta. Já me peguei olhando para outro ministério que cresceu mais rápido e pensando: "Senhor, e nós, que estamos aqui ralando há tanto tempo?". Já me peguei olhando pra alguém que acabou de chegar sendo muito elogiado e sentindo uma coisinha apertar aqui dentro. Isso tem nome. O texto chama de olho mau. </w:t>
-      </w:r>
-      <w:r>
-        <w:rPr>
-          <w:rFonts w:ascii="Cambria" w:cs="Cambria" w:eastAsia="Cambria" w:hAnsi="Cambria"/>
-          <w:b/>
-          <w:bCs/>
-          <w:color w:val="2B2B33"/>
-          <w:sz w:val="23"/>
-          <w:szCs w:val="23"/>
-        </w:rPr>
-        <w:t xml:space="preserve">[Personalizar com um episódio seu, se quiser.]</w:t>
-      </w:r>
-    </w:p>
-    <w:p>
-      <w:pPr>
-        <w:spacing w:after="150" w:before="0" w:line="300" w:lineRule="auto"/>
-        <w:jc w:val="left"/>
-      </w:pPr>
-      <w:r>
-        <w:rPr>
-          <w:rFonts w:ascii="Cambria" w:cs="Cambria" w:eastAsia="Cambria" w:hAnsi="Cambria"/>
-          <w:color w:val="2B2B33"/>
-          <w:sz w:val="23"/>
-          <w:szCs w:val="23"/>
-        </w:rPr>
-        <w:t xml:space="preserve">E com vocês não é diferente. Olha como isso aparece:</w:t>
+        <w:t xml:space="preserve">Isso não é coisa de outra igreja. É coisa de toda igreja. É coisa da nossa.</w:t>
+      </w:r>
+    </w:p>
+    <w:p>
+      <w:pPr>
+        <w:spacing w:after="150" w:before="0" w:line="300" w:lineRule="auto"/>
+        <w:jc w:val="left"/>
+      </w:pPr>
+      <w:r>
+        <w:rPr>
+          <w:rFonts w:ascii="Cambria" w:cs="Cambria" w:eastAsia="Cambria" w:hAnsi="Cambria"/>
+          <w:b/>
+          <w:bCs/>
+          <w:i/>
+          <w:iCs/>
+          <w:color w:val="9C6F3D"/>
+          <w:sz w:val="22"/>
+          <w:szCs w:val="22"/>
+        </w:rPr>
+        <w:t xml:space="preserve">[Momento de autoimplicação — oral, ao vivo.]</w:t>
+      </w:r>
+    </w:p>
+    <w:p>
+      <w:pPr>
+        <w:spacing w:after="150" w:before="0" w:line="300" w:lineRule="auto"/>
+        <w:jc w:val="left"/>
+      </w:pPr>
+      <w:r>
+        <w:rPr>
+          <w:rFonts w:ascii="Cambria" w:cs="Cambria" w:eastAsia="Cambria" w:hAnsi="Cambria"/>
+          <w:color w:val="2B2B33"/>
+          <w:sz w:val="23"/>
+          <w:szCs w:val="23"/>
+        </w:rPr>
+        <w:t xml:space="preserve">Isso aparece assim:</w:t>
       </w:r>
     </w:p>
     <w:p>
@@ -3221,7 +3190,7 @@
           <w:sz w:val="23"/>
           <w:szCs w:val="23"/>
         </w:rPr>
-        <w:t xml:space="preserve">Aparece quando o recém-convertido dá um testemunho lindo e todo mundo chora, e você, que está aqui há anos, pensa: "e eu, que nunca dei trabalho?". Aparece quando você serve há muito tempo, carregou peso que ninguém viu, e vê gente nova chegando e já sendo celebrada. Aparece no inventário da família: "eu cuidei da mãe dez anos sozinha; meu irmão só aparecia no Natal, e herdou igual". Aparece toda noite no celular, quando a gente fica assistindo ao pagamento dos outros na rede social — a viagem, a promoção, o carro, o casamento — e o nosso denário, que de manhã era alívio, de noite vira ofensa.</w:t>
+        <w:t xml:space="preserve">Aparece quando o recém-convertido dá um testemunho lindo e todo mundo chora, e você, que está aqui há anos, pensa: "e eu, que nunca dei trabalho?". Aparece quando você serve há muito tempo, carregou peso que ninguém viu, e vê gente nova chegando e já sendo celebrada. Aparece no inventário da família: "eu cuidei da mãe dez anos sozinha; meu irmão só aparecia no Natal, e herdou igual". Aparece toda noite no celular. A gente fica assistindo ao pagamento dos outros na rede social — a viagem, a promoção, o carro, o casamento. E o nosso denário, que de manhã era alívio, de noite vira ofensa.</w:t>
       </w:r>
     </w:p>
     <w:p>
@@ -3251,7 +3220,7 @@
           <w:sz w:val="23"/>
           <w:szCs w:val="23"/>
         </w:rPr>
-        <w:t xml:space="preserve">O Kierkegaard dizia que a preocupação mundana sempre quer arrastar a gente para dentro das comparações:</w:t>
+        <w:t xml:space="preserve">Kierkegaard dizia que a preocupação mundana sempre quer arrastar a gente para dentro das comparações:</w:t>
       </w:r>
     </w:p>
     <w:tbl>
@@ -3397,37 +3366,28 @@
       <w:r>
         <w:rPr>
           <w:rFonts w:ascii="Cambria" w:cs="Cambria" w:eastAsia="Cambria" w:hAnsi="Cambria"/>
-          <w:color w:val="2B2B33"/>
-          <w:sz w:val="23"/>
-          <w:szCs w:val="23"/>
-        </w:rPr>
-        <w:t xml:space="preserve">Uma frase pra guardar: </w:t>
-      </w:r>
-      <w:r>
-        <w:rPr>
-          <w:rFonts w:ascii="Cambria" w:cs="Cambria" w:eastAsia="Cambria" w:hAnsi="Cambria"/>
-          <w:b/>
-          <w:bCs/>
-          <w:color w:val="2B2B33"/>
-          <w:sz w:val="23"/>
-          <w:szCs w:val="23"/>
-        </w:rPr>
-        <w:t xml:space="preserve">a graça que alegra o último expõe o coração que calcula.</w:t>
-      </w:r>
-    </w:p>
-    <w:p>
-      <w:pPr>
-        <w:spacing w:after="150" w:before="0" w:line="300" w:lineRule="auto"/>
-        <w:jc w:val="left"/>
-      </w:pPr>
-      <w:r>
-        <w:rPr>
-          <w:rFonts w:ascii="Cambria" w:cs="Cambria" w:eastAsia="Cambria" w:hAnsi="Cambria"/>
-          <w:color w:val="2B2B33"/>
-          <w:sz w:val="23"/>
-          <w:szCs w:val="23"/>
-        </w:rPr>
-        <w:t xml:space="preserve">E aqui vem a pergunta mais importante do sermão. Repara: o dono não consertou o olho dos murmuradores mudando o salário. Ele não tirou dos últimos para agradar os primeiros. Não deu mais aos primeiros para comprar a paz. E a gente também não conserta o olho se esforçando para não sentir inveja. Dá para engolir a murmuração. Dá para sorrir amarelo e dizer "que bom pra ele". Mas não dá para fabricar um olho bom.</w:t>
+          <w:b/>
+          <w:bCs/>
+          <w:color w:val="2B2B33"/>
+          <w:sz w:val="23"/>
+          <w:szCs w:val="23"/>
+        </w:rPr>
+        <w:t xml:space="preserve">A graça que alegra o último expõe o coração que calcula.</w:t>
+      </w:r>
+    </w:p>
+    <w:p>
+      <w:pPr>
+        <w:spacing w:after="150" w:before="0" w:line="300" w:lineRule="auto"/>
+        <w:jc w:val="left"/>
+      </w:pPr>
+      <w:r>
+        <w:rPr>
+          <w:rFonts w:ascii="Cambria" w:cs="Cambria" w:eastAsia="Cambria" w:hAnsi="Cambria"/>
+          <w:color w:val="2B2B33"/>
+          <w:sz w:val="23"/>
+          <w:szCs w:val="23"/>
+        </w:rPr>
+        <w:t xml:space="preserve">O dono não consertou o olho dos murmuradores mudando o salário. Ele não tirou dos últimos para agradar os primeiros. Não deu mais aos primeiros para comprar a paz. E a gente também não conserta o olho se esforçando para não sentir inveja. Dá para engolir a murmuração. Dá para sorrir amarelo e dizer "que bom pra ele". Mas não dá para fabricar um olho bom.</w:t>
       </w:r>
     </w:p>
     <w:p>
@@ -3510,7 +3470,7 @@
           <w:sz w:val="23"/>
           <w:szCs w:val="23"/>
         </w:rPr>
-        <w:t xml:space="preserve">Vamos voltar a uma palavrinha do verso 15. O dono diz: "Não me é lícito fazer o que quero do que é </w:t>
+        <w:t xml:space="preserve">No verso 15, o dono diz: "Não me é lícito fazer o que quero do que é </w:t>
       </w:r>
       <w:r>
         <w:rPr>
@@ -3545,7 +3505,7 @@
           <w:sz w:val="23"/>
           <w:szCs w:val="23"/>
         </w:rPr>
-        <w:t xml:space="preserve">E olha o que Mateus coloca logo depois da parábola. Verso 17: "Estando Jesus para subir a Jerusalém, chamou à parte os doze e, em caminho, lhes disse: Eis que subimos para Jerusalém, e o Filho do Homem será entregue aos principais sacerdotes e aos escribas. Eles o condenarão à morte. E o entregarão aos gentios para ser escarnecido, açoitado e crucificado" (vv. 17-19). E no verso 28: "o Filho do Homem não veio para ser servido, mas para servir e dar a sua vida em </w:t>
+        <w:t xml:space="preserve">Logo depois da parábola, Mateus coloca o verso 17: "Estando Jesus para subir a Jerusalém, chamou à parte os doze e, em caminho, lhes disse: Eis que subimos para Jerusalém, e o Filho do Homem será entregue aos principais sacerdotes e aos escribas. Eles o condenarão à morte. E o entregarão aos gentios para ser escarnecido, açoitado e crucificado" (vv. 17-19). E no verso 28: "o Filho do Homem não veio para ser servido, mas para servir e dar a sua vida em </w:t>
       </w:r>
       <w:r>
         <w:rPr>
@@ -3580,7 +3540,7 @@
           <w:sz w:val="23"/>
           <w:szCs w:val="23"/>
         </w:rPr>
-        <w:t xml:space="preserve">Resgate. O preço da libertação. Irmãos, a bondade do Rei custa ao próprio Rei.</w:t>
+        <w:t xml:space="preserve">Resgate. O preço da libertação. A bondade do Rei custa ao próprio Rei.</w:t>
       </w:r>
     </w:p>
     <w:p>
@@ -3625,22 +3585,22 @@
           <w:sz w:val="23"/>
           <w:szCs w:val="23"/>
         </w:rPr>
-        <w:t xml:space="preserve">Lembra das horas da parábola? Sexta hora, nona hora. Mateus vai usar essas mesmas horas de novo, lá no capítulo 27: "Desde a hora sexta até a hora nona, houve trevas sobre toda a terra" (27.45). Foi ali, entre a sexta e a nona hora, que o Filho suportou o calor de verdade — o calor do juízo que era nosso. Não estou dizendo que a parábola foi escrita como um código das horas da cruz. Estou dizendo que, quando a gente olha para a cruz, entende quem realmente aguentou o peso do dia.</w:t>
-      </w:r>
-    </w:p>
-    <w:p>
-      <w:pPr>
-        <w:spacing w:after="150" w:before="0" w:line="300" w:lineRule="auto"/>
-        <w:jc w:val="left"/>
-      </w:pPr>
-      <w:r>
-        <w:rPr>
-          <w:rFonts w:ascii="Cambria" w:cs="Cambria" w:eastAsia="Cambria" w:hAnsi="Cambria"/>
-          <w:color w:val="2B2B33"/>
-          <w:sz w:val="23"/>
-          <w:szCs w:val="23"/>
-        </w:rPr>
-        <w:t xml:space="preserve">O nosso Catecismo de Heidelberg diz isso com uma precisão que me emociona. Na pergunta 60, ele pergunta como somos justos diante de Deus, e responde:</w:t>
+        <w:t xml:space="preserve">As horas da parábola — sexta hora, nona hora — voltam em Mateus, no capítulo 27: "Desde a hora sexta até a hora nona, houve trevas sobre toda a terra" (27.45). Foi ali, entre a sexta e a nona hora, que o Filho suportou o calor de verdade — o calor do juízo que era nosso. A parábola não foi escrita como um código das horas da cruz. Mas, quando a gente olha para a cruz, entende quem realmente aguentou o peso do dia.</w:t>
+      </w:r>
+    </w:p>
+    <w:p>
+      <w:pPr>
+        <w:spacing w:after="150" w:before="0" w:line="300" w:lineRule="auto"/>
+        <w:jc w:val="left"/>
+      </w:pPr>
+      <w:r>
+        <w:rPr>
+          <w:rFonts w:ascii="Cambria" w:cs="Cambria" w:eastAsia="Cambria" w:hAnsi="Cambria"/>
+          <w:color w:val="2B2B33"/>
+          <w:sz w:val="23"/>
+          <w:szCs w:val="23"/>
+        </w:rPr>
+        <w:t xml:space="preserve">O Catecismo de Heidelberg diz isso com precisão. Na pergunta 60, ele pergunta como somos justos diante de Deus, e responde:</w:t>
       </w:r>
     </w:p>
     <w:tbl>
@@ -3725,22 +3685,22 @@
           <w:sz w:val="23"/>
           <w:szCs w:val="23"/>
         </w:rPr>
-        <w:t xml:space="preserve">"Como se eu mesmo tivesse cumprido toda a obediência." Irmãos, isso é ser tratado como quem trabalhou o dia inteiro. Gente da undécima hora — ou nem isso — recebendo o salário de quem trabalhou de sol a sol.</w:t>
-      </w:r>
-    </w:p>
-    <w:p>
-      <w:pPr>
-        <w:spacing w:after="150" w:before="0" w:line="300" w:lineRule="auto"/>
-        <w:jc w:val="left"/>
-      </w:pPr>
-      <w:r>
-        <w:rPr>
-          <w:rFonts w:ascii="Cambria" w:cs="Cambria" w:eastAsia="Cambria" w:hAnsi="Cambria"/>
-          <w:color w:val="2B2B33"/>
-          <w:sz w:val="23"/>
-          <w:szCs w:val="23"/>
-        </w:rPr>
-        <w:t xml:space="preserve">E tem mais uma cena do Antigo Testamento que ajuda a enxergar isso. Em 1 Samuel 30, Davi volta de uma batalha com o despojo. Duzentos homens tinham ficado para trás, exaustos demais para lutar, guardando a bagagem. E alguns dos que lutaram — a Bíblia chama de "maus e filhos de Belial" — disseram: "esses aí não vão receber nada". E Davi, o rei, decretou: "Qual é a parte dos que desceram à peleja, tal será a parte dos que ficaram com a bagagem; </w:t>
+        <w:t xml:space="preserve">É o que Paulo diz: "Aquele que não conheceu pecado, ele o fez pecado por nós; para que, nele, fôssemos feitos justiça de Deus" (2Co 5.21). "Como se eu mesmo tivesse cumprido toda a obediência" é ser tratado como quem trabalhou o dia inteiro. Gente da undécima hora — ou nem isso — recebendo o salário de quem trabalhou de sol a sol.</w:t>
+      </w:r>
+    </w:p>
+    <w:p>
+      <w:pPr>
+        <w:spacing w:after="150" w:before="0" w:line="300" w:lineRule="auto"/>
+        <w:jc w:val="left"/>
+      </w:pPr>
+      <w:r>
+        <w:rPr>
+          <w:rFonts w:ascii="Cambria" w:cs="Cambria" w:eastAsia="Cambria" w:hAnsi="Cambria"/>
+          <w:color w:val="2B2B33"/>
+          <w:sz w:val="23"/>
+          <w:szCs w:val="23"/>
+        </w:rPr>
+        <w:t xml:space="preserve">Uma cena do Antigo Testamento ajuda a enxergar isso. Em 1 Samuel 30, Davi volta de uma batalha com o despojo. Duzentos homens tinham ficado para trás, exaustos demais para lutar, guardando a bagagem. E alguns dos que lutaram — a Bíblia chama de "maus e filhos de Belial" — disseram: "esses aí não vão receber nada". E Davi, o rei, decretou: "Qual é a parte dos que desceram à peleja, tal será a parte dos que ficaram com a bagagem; </w:t>
       </w:r>
       <w:r>
         <w:rPr>
@@ -3809,7 +3769,7 @@
           <w:sz w:val="23"/>
           <w:szCs w:val="23"/>
         </w:rPr>
-        <w:t xml:space="preserve">E agora olha o último quadro dessa moldura. Jesus está saindo de Jericó, a caminho de Jerusalém, a caminho da cruz. Dois cegos estão à beira do caminho. E eles gritam: "</w:t>
+        <w:t xml:space="preserve">O último quadro dessa moldura: Jesus está saindo de Jericó, a caminho de Jerusalém, a caminho da cruz. Dois cegos estão à beira do caminho. E eles gritam: "</w:t>
       </w:r>
       <w:r>
         <w:rPr>
@@ -3929,52 +3889,52 @@
           <w:sz w:val="23"/>
           <w:szCs w:val="23"/>
         </w:rPr>
-        <w:t xml:space="preserve">Irmãos, olha que coisa linda. A seção que começou diagnosticando o olho mau termina com Jesus curando olhos. O olho mau não se cura com esforço. Se cura com o toque de Cristo.</w:t>
-      </w:r>
-    </w:p>
-    <w:p>
-      <w:pPr>
-        <w:spacing w:after="150" w:before="0" w:line="300" w:lineRule="auto"/>
-        <w:jc w:val="left"/>
-      </w:pPr>
-      <w:r>
-        <w:rPr>
-          <w:rFonts w:ascii="Cambria" w:cs="Cambria" w:eastAsia="Cambria" w:hAnsi="Cambria"/>
-          <w:color w:val="2B2B33"/>
-          <w:sz w:val="23"/>
-          <w:szCs w:val="23"/>
-        </w:rPr>
-        <w:t xml:space="preserve">E repara no que os cegos pedem. Eles não pedem recompensa. Não apresentam currículo. Não dizem "a gente esperou o dia inteiro na beira da estrada". Eles pedem misericórdia. Essa é a postura da undécima hora.</w:t>
-      </w:r>
-    </w:p>
-    <w:p>
-      <w:pPr>
-        <w:spacing w:after="150" w:before="0" w:line="300" w:lineRule="auto"/>
-        <w:jc w:val="left"/>
-      </w:pPr>
-      <w:r>
-        <w:rPr>
-          <w:rFonts w:ascii="Cambria" w:cs="Cambria" w:eastAsia="Cambria" w:hAnsi="Cambria"/>
-          <w:color w:val="2B2B33"/>
-          <w:sz w:val="23"/>
-          <w:szCs w:val="23"/>
-        </w:rPr>
-        <w:t xml:space="preserve">E repara no que acontece depois da cura: "o foram seguindo". O fruto do olho curado não é status. Não é trono à direita ou à esquerda. É seguir Jesus.</w:t>
-      </w:r>
-    </w:p>
-    <w:p>
-      <w:pPr>
-        <w:spacing w:after="150" w:before="0" w:line="300" w:lineRule="auto"/>
-        <w:jc w:val="left"/>
-      </w:pPr>
-      <w:r>
-        <w:rPr>
-          <w:rFonts w:ascii="Cambria" w:cs="Cambria" w:eastAsia="Cambria" w:hAnsi="Cambria"/>
-          <w:color w:val="2B2B33"/>
-          <w:sz w:val="23"/>
-          <w:szCs w:val="23"/>
-        </w:rPr>
-        <w:t xml:space="preserve">Quando você vê a cruz direito, você deixa de precisar estar acima de alguém. Se o Rei pagou a própria bondade com a própria vida, ninguém aqui pode cobrar nada dele. E ninguém aqui precisa competir com ninguém. Porque o que ele reparte não é um bolo que diminui quando outro come. Lá em Gênesis 15, Deus disse a Abraão: "Eu sou o teu escudo, o teu grandíssimo galardão" (Gn 15.1). A recompensa, no fim das contas, é ele mesmo. E não se divide por horas aquilo que é uma Pessoa. O fato de outro receber Deus não diminui em nada a minha parte de Deus.</w:t>
+        <w:t xml:space="preserve">A seção que começou diagnosticando o olho mau termina com Jesus curando olhos. O olho mau não se cura com esforço. Se cura com o toque de Cristo.</w:t>
+      </w:r>
+    </w:p>
+    <w:p>
+      <w:pPr>
+        <w:spacing w:after="150" w:before="0" w:line="300" w:lineRule="auto"/>
+        <w:jc w:val="left"/>
+      </w:pPr>
+      <w:r>
+        <w:rPr>
+          <w:rFonts w:ascii="Cambria" w:cs="Cambria" w:eastAsia="Cambria" w:hAnsi="Cambria"/>
+          <w:color w:val="2B2B33"/>
+          <w:sz w:val="23"/>
+          <w:szCs w:val="23"/>
+        </w:rPr>
+        <w:t xml:space="preserve">Os cegos não pedem recompensa. Não apresentam currículo. Não dizem "a gente esperou o dia inteiro na beira da estrada". Eles pedem misericórdia. Essa é a postura da undécima hora.</w:t>
+      </w:r>
+    </w:p>
+    <w:p>
+      <w:pPr>
+        <w:spacing w:after="150" w:before="0" w:line="300" w:lineRule="auto"/>
+        <w:jc w:val="left"/>
+      </w:pPr>
+      <w:r>
+        <w:rPr>
+          <w:rFonts w:ascii="Cambria" w:cs="Cambria" w:eastAsia="Cambria" w:hAnsi="Cambria"/>
+          <w:color w:val="2B2B33"/>
+          <w:sz w:val="23"/>
+          <w:szCs w:val="23"/>
+        </w:rPr>
+        <w:t xml:space="preserve">E depois da cura: "o foram seguindo". O fruto do olho curado não é status. Não é trono à direita ou à esquerda. É seguir Jesus.</w:t>
+      </w:r>
+    </w:p>
+    <w:p>
+      <w:pPr>
+        <w:spacing w:after="150" w:before="0" w:line="300" w:lineRule="auto"/>
+        <w:jc w:val="left"/>
+      </w:pPr>
+      <w:r>
+        <w:rPr>
+          <w:rFonts w:ascii="Cambria" w:cs="Cambria" w:eastAsia="Cambria" w:hAnsi="Cambria"/>
+          <w:color w:val="2B2B33"/>
+          <w:sz w:val="23"/>
+          <w:szCs w:val="23"/>
+        </w:rPr>
+        <w:t xml:space="preserve">Quando você vê a cruz direito, deixa de precisar estar acima de alguém. Se o Rei pagou a própria bondade com a própria vida, ninguém aqui pode cobrar nada dele. E ninguém aqui precisa competir com ninguém. O que ele reparte não é um bolo que diminui quando outro come. Lá em Gênesis 15, Deus disse a Abraão: "Eu sou o teu escudo, o teu grandíssimo galardão" (Gn 15.1). A recompensa, no fim das contas, é ele mesmo. E não se divide por horas aquilo que é uma Pessoa.</w:t>
       </w:r>
     </w:p>
     <w:p>
@@ -4025,21 +3985,6 @@
           <w:sz w:val="23"/>
           <w:szCs w:val="23"/>
         </w:rPr>
-        <w:t xml:space="preserve">Eu não quero terminar só com diagnóstico. Então vamos ser bem práticos.</w:t>
-      </w:r>
-    </w:p>
-    <w:p>
-      <w:pPr>
-        <w:spacing w:after="150" w:before="0" w:line="300" w:lineRule="auto"/>
-        <w:jc w:val="left"/>
-      </w:pPr>
-      <w:r>
-        <w:rPr>
-          <w:rFonts w:ascii="Cambria" w:cs="Cambria" w:eastAsia="Cambria" w:hAnsi="Cambria"/>
-          <w:color w:val="2B2B33"/>
-          <w:sz w:val="23"/>
-          <w:szCs w:val="23"/>
-        </w:rPr>
         <w:t xml:space="preserve">Primeiro, o que </w:t>
       </w:r>
       <w:r>
@@ -4075,7 +4020,7 @@
           <w:sz w:val="23"/>
           <w:szCs w:val="23"/>
         </w:rPr>
-        <w:t xml:space="preserve">E agora, o que fazer nesta semana. Quatro passos.</w:t>
+        <w:t xml:space="preserve">O que fazer nesta semana. Quatro passos.</w:t>
       </w:r>
     </w:p>
     <w:p>
@@ -4179,22 +4124,7 @@
           <w:sz w:val="23"/>
           <w:szCs w:val="23"/>
         </w:rPr>
-        <w:t xml:space="preserve"> Quando alguém receber o que você queria — o novo convertido no ministério, o colega promovido, o irmão abençoado —, faça três coisas concretas: agradeça a Deus por ele, pelo nome. Diga a ele uma palavra de alegria sincera. E, se puder, ajude-o a florescer. "Alegrai-vos com os que se alegram" (Rm 12.15) é o mandamento mais difícil para o olho mau. Por isso mesmo é o remédio. E faça, nesta semana, um serviço que ninguém vai saber (Mt 6.1-4). Serviço escondido desliga o caixa.</w:t>
-      </w:r>
-    </w:p>
-    <w:p>
-      <w:pPr>
-        <w:spacing w:after="150" w:before="0" w:line="300" w:lineRule="auto"/>
-        <w:jc w:val="left"/>
-      </w:pPr>
-      <w:r>
-        <w:rPr>
-          <w:rFonts w:ascii="Cambria" w:cs="Cambria" w:eastAsia="Cambria" w:hAnsi="Cambria"/>
-          <w:color w:val="2B2B33"/>
-          <w:sz w:val="23"/>
-          <w:szCs w:val="23"/>
-        </w:rPr>
-        <w:t xml:space="preserve">E deixa eu falar com você especificamente.</w:t>
+        <w:t xml:space="preserve"> Quando alguém receber o que você queria — o novo convertido no ministério, o colega promovido, o irmão abençoado —, faça três coisas concretas. Agradeça a Deus por ele, pelo nome. Diga a ele uma palavra de alegria sincera. E, se puder, ajude-o a florescer. "Alegrai-vos com os que se alegram" (Rm 12.15) é o mandamento mais difícil para o olho mau. Por isso mesmo é o remédio. E faça, nesta semana, um serviço que ninguém vai saber (Mt 6.1-4). Serviço escondido desliga o caixa.</w:t>
       </w:r>
     </w:p>
     <w:p>
@@ -4239,22 +4169,22 @@
           <w:sz w:val="23"/>
           <w:szCs w:val="23"/>
         </w:rPr>
-        <w:t xml:space="preserve">E você que ainda não crê, ou que acha que é tarde demais: lembra do ladrão na cruz? Ele nunca foi batizado. Nunca participou de um culto. Nunca leu um versículo. Não tinha um minuto de serviço pra apresentar. E ouviu: "hoje estarás comigo no paraíso". O Rei ainda sai à praça às cinco da tarde. "Ninguém me contratou" não é o fim da sua história. Ele está chamando agora. E ele paga o dia inteiro.</w:t>
-      </w:r>
-    </w:p>
-    <w:p>
-      <w:pPr>
-        <w:spacing w:after="150" w:before="0" w:line="300" w:lineRule="auto"/>
-        <w:jc w:val="left"/>
-      </w:pPr>
-      <w:r>
-        <w:rPr>
-          <w:rFonts w:ascii="Cambria" w:cs="Cambria" w:eastAsia="Cambria" w:hAnsi="Cambria"/>
-          <w:color w:val="2B2B33"/>
-          <w:sz w:val="23"/>
-          <w:szCs w:val="23"/>
-        </w:rPr>
-        <w:t xml:space="preserve">Mas também tem uma palavra para você que acha que é melhor do que muito crente por aí: enquanto você estiver contando horas, a graça vai parecer injustiça para você. A porta do Reino só se abre para quem descobre que estava na praça.</w:t>
+        <w:t xml:space="preserve">Você que ainda não crê, ou que acha que é tarde demais: lembra do ladrão na cruz? Ele nunca foi batizado. Nunca participou de um culto. Nunca leu um versículo. Não tinha um minuto de serviço pra apresentar. E ouviu: "hoje estarás comigo no paraíso". O Rei ainda sai à praça às cinco da tarde. "Ninguém me contratou" não é o fim da sua história. Ele está chamando agora. E ele paga o dia inteiro.</w:t>
+      </w:r>
+    </w:p>
+    <w:p>
+      <w:pPr>
+        <w:spacing w:after="150" w:before="0" w:line="300" w:lineRule="auto"/>
+        <w:jc w:val="left"/>
+      </w:pPr>
+      <w:r>
+        <w:rPr>
+          <w:rFonts w:ascii="Cambria" w:cs="Cambria" w:eastAsia="Cambria" w:hAnsi="Cambria"/>
+          <w:color w:val="2B2B33"/>
+          <w:sz w:val="23"/>
+          <w:szCs w:val="23"/>
+        </w:rPr>
+        <w:t xml:space="preserve">E você que acha que é melhor do que muito crente por aí: enquanto estiver contando horas, a graça vai parecer injustiça. A porta do Reino só se abre para quem descobre que estava na praça.</w:t>
       </w:r>
     </w:p>
     <w:p>
@@ -4320,7 +4250,7 @@
           <w:sz w:val="23"/>
           <w:szCs w:val="23"/>
         </w:rPr>
-        <w:t xml:space="preserve">Vamos voltar aos dois homens do começo.</w:t>
+        <w:t xml:space="preserve">Os dois homens do começo.</w:t>
       </w:r>
     </w:p>
     <w:p>
@@ -4365,7 +4295,7 @@
           <w:sz w:val="23"/>
           <w:szCs w:val="23"/>
         </w:rPr>
-        <w:t xml:space="preserve">A parábola terminou com uma pergunta que Jesus não respondeu por eles. E eu também não vou responder por você. Ela fica com você: </w:t>
+        <w:t xml:space="preserve">A parábola terminou com uma pergunta que Jesus não respondeu por eles. Ela fica com você: </w:t>
       </w:r>
       <w:r>
         <w:rPr>
@@ -4391,7 +4321,7 @@
           <w:sz w:val="23"/>
           <w:szCs w:val="23"/>
         </w:rPr>
-        <w:t xml:space="preserve">Mas eu posso te mostrar uma resposta possível. É a oração dos cegos: "Senhor, Filho de Davi, tem compaixão de nós. Abre os nossos olhos."</w:t>
+        <w:t xml:space="preserve">Há uma resposta possível: a oração dos cegos. "Senhor, Filho de Davi, tem compaixão de nós. Abre os nossos olhos."</w:t>
       </w:r>
     </w:p>
     <w:p>
@@ -4698,7 +4628,7 @@
           <w:sz w:val="23"/>
           <w:szCs w:val="23"/>
         </w:rPr>
-        <w:t xml:space="preserve"> (ponto III): o trecho do pastor que se pega fazendo conta é genérico; personalize com um episódio seu.</w:t>
+        <w:t xml:space="preserve"> (ponto III): retirada do manuscrito pelo polimento; fica para o momento, ao vivo.</w:t>
       </w:r>
     </w:p>
     <w:p>

</xml_diff>